<commit_message>
Fix informal slang in advisor-facing summary, use formal academic tone
</commit_message>
<xml_diff>
--- a/논문_요약본_쉬운버전.docx
+++ b/논문_요약본_쉬운버전.docx
@@ -12,10 +12,10 @@
           <w:rFonts w:ascii="맑은 고딕" w:cs="맑은 고딕" w:eastAsia="맑은 고딕" w:hAnsi="맑은 고딕"/>
           <w:b/>
           <w:bCs/>
-          <w:sz w:val="30"/>
-          <w:szCs w:val="30"/>
-        </w:rPr>
-        <w:t xml:space="preserve">한눈에 보는 논문 요약</w:t>
+          <w:sz w:val="28"/>
+          <w:szCs w:val="28"/>
+        </w:rPr>
+        <w:t xml:space="preserve">논문 요약 (지도교수님 검토용 축약본)</w:t>
       </w:r>
     </w:p>
     <w:p>
@@ -44,7 +44,7 @@
           <w:sz w:val="21"/>
           <w:szCs w:val="21"/>
         </w:rPr>
-        <w:t xml:space="preserve">네이버 검색량 데이터로 "다음에 뜰 화장품 키워드"를 미리 예측하는 모델을 만들고, 성분·컨셉·제형·효능 중 어떤 종류가 더 예측하기 쉬운지 비교하는 연구.</w:t>
+        <w:t xml:space="preserve">네이버 검색량 데이터를 활용하여 화장품 키워드(성분·컨셉·제형·효능)의 향후 breakout(트렌드 진입) 여부를 사전에 예측하는 모델을 개발하고, 네 가지 카테고리 중 어떤 유형이 더 예측하기 쉬운지 비교하는 연구입니다.</w:t>
       </w:r>
     </w:p>
     <w:p>
@@ -60,7 +60,7 @@
           <w:sz w:val="26"/>
           <w:szCs w:val="26"/>
         </w:rPr>
-        <w:t xml:space="preserve">1. 왜 이 주제?</w:t>
+        <w:t xml:space="preserve">1. 연구 배경</w:t>
       </w:r>
     </w:p>
     <w:p>
@@ -78,7 +78,7 @@
           <w:sz w:val="21"/>
           <w:szCs w:val="21"/>
         </w:rPr>
-        <w:t xml:space="preserve">화장품은 트렌드가 빨리 바뀌는데, 신제품 만드는 데는 시간이 오래 걸림 → 트렌드를 미리 알면 유리함.</w:t>
+        <w:t xml:space="preserve">화장품은 트렌드 변화가 빠른 반면 신제품 개발에는 시간이 걸려, 트렌드를 조기에 포착하는 것이 실무적으로 중요합니다.</w:t>
       </w:r>
     </w:p>
     <w:p>
@@ -96,7 +96,7 @@
           <w:sz w:val="21"/>
           <w:szCs w:val="21"/>
         </w:rPr>
-        <w:t xml:space="preserve">한국 화장품 수출이 2025년 사상 최대(세계 2위 수출국)일 만큼 시장이 빠르게 크고 있어서, 이런 예측이 실무적으로 더 중요해지는 중.</w:t>
+        <w:t xml:space="preserve">한국 화장품 수출은 2025년 사상 최대(세계 2위 수출국)를 기록할 만큼 시장이 빠르게 성장하고 있어, 이러한 예측의 실무적 가치가 커지고 있습니다.</w:t>
       </w:r>
     </w:p>
     <w:p>
@@ -114,7 +114,7 @@
           <w:sz w:val="21"/>
           <w:szCs w:val="21"/>
         </w:rPr>
-        <w:t xml:space="preserve">기존 화장품 트렌드 연구들은 대부분 "이미 떴던 것"을 설명만 함(텍스트마이닝). "다음에 뜰 것"을 미리 예측하는 연구는 거의 없음.</w:t>
+        <w:t xml:space="preserve">기존 화장품 트렌드 연구는 대부분 이미 발생한 트렌드를 사후적으로 설명하는 데 그치고 있으며, 향후 무엇이 유행할지 사전에 예측하는 연구는 드뭅니다.</w:t>
       </w:r>
     </w:p>
     <w:p>
@@ -143,20 +143,20 @@
           <w:sz w:val="21"/>
           <w:szCs w:val="21"/>
         </w:rPr>
-        <w:t xml:space="preserve">RQ1: 검색량이 오르는 초기 패턴만 보고, 이 키워드가 나중에 "떡상(breakout)"할지 미리 맞출 수 있을까?</w:t>
-      </w:r>
-    </w:p>
-    <w:p>
-      <w:pPr>
-        <w:spacing w:after="80" w:line="280"/>
-      </w:pPr>
-      <w:r>
-        <w:rPr>
-          <w:rFonts w:ascii="맑은 고딕" w:cs="맑은 고딕" w:eastAsia="맑은 고딕" w:hAnsi="맑은 고딕"/>
-          <w:sz w:val="21"/>
-          <w:szCs w:val="21"/>
-        </w:rPr>
-        <w:t xml:space="preserve">RQ2: 성분/컨셉/제형/효능 중에서 어떤 카테고리가 더 예측하기 쉬울까?</w:t>
+        <w:t xml:space="preserve">RQ1: 초기 검색량 상승 패턴으로 향후 특정 키워드의 breakout 여부를 예측할 수 있는가?</w:t>
+      </w:r>
+    </w:p>
+    <w:p>
+      <w:pPr>
+        <w:spacing w:after="80" w:line="280"/>
+      </w:pPr>
+      <w:r>
+        <w:rPr>
+          <w:rFonts w:ascii="맑은 고딕" w:cs="맑은 고딕" w:eastAsia="맑은 고딕" w:hAnsi="맑은 고딕"/>
+          <w:sz w:val="21"/>
+          <w:szCs w:val="21"/>
+        </w:rPr>
+        <w:t xml:space="preserve">RQ2: 성분/컨셉/제형/효능 네 카테고리 간에 예측 가능성의 차이가 있는가?</w:t>
       </w:r>
     </w:p>
     <w:p>
@@ -172,7 +172,7 @@
           <w:sz w:val="26"/>
           <w:szCs w:val="26"/>
         </w:rPr>
-        <w:t xml:space="preserve">3. 선행연구에서 가져오는 것 (내가 새로 만들지 않는 부분)</w:t>
+        <w:t xml:space="preserve">3. 선행연구에서 차용하는 것</w:t>
       </w:r>
     </w:p>
     <w:tbl>
@@ -500,7 +500,7 @@
           <w:sz w:val="26"/>
           <w:szCs w:val="26"/>
         </w:rPr>
-        <w:t xml:space="preserve">4. 내가 새로 하는 것 (진짜 차별점)</w:t>
+        <w:t xml:space="preserve">4. 본 연구의 차별점</w:t>
       </w:r>
     </w:p>
     <w:p>
@@ -518,7 +518,7 @@
           <w:sz w:val="21"/>
           <w:szCs w:val="21"/>
         </w:rPr>
-        <w:t xml:space="preserve">이 "떡상 예측" 방법을 화장품 + 네이버 검색 데이터에 처음 적용 (기존엔 해시태그·주식에만 있었음)</w:t>
+        <w:t xml:space="preserve">breakout 예측이라는 검증된 방법론을 화장품·네이버 검색 트렌드 도메인에 처음 적용합니다(해외 선행연구는 해시태그·주식 도메인에 한정).</w:t>
       </w:r>
     </w:p>
     <w:p>
@@ -536,7 +536,7 @@
           <w:sz w:val="21"/>
           <w:szCs w:val="21"/>
         </w:rPr>
-        <w:t xml:space="preserve">성분/컨셉/제형/효능처럼 "의미가 다른" 카테고리끼리 예측 난이도를 비교 — 기존 연구는 "트렌드 모양"(갑자기 vs 꾸준히)으로만 비교했지, 우리처럼 "무슨 종류의 키워드인지"로 비교한 적은 없음</w:t>
+        <w:t xml:space="preserve">성분/컨셉/제형/효능처럼 의미론적으로 이질적인 카테고리 간 예측 가능성을 정면으로 비교합니다. 선행연구는 트렌드의 형태(급등형 vs 완만형)로만 비교했을 뿐, 키워드의 의미 유형으로 비교한 사례는 확인되지 않았습니다.</w:t>
       </w:r>
     </w:p>
     <w:p>
@@ -554,7 +554,7 @@
           <w:sz w:val="21"/>
           <w:szCs w:val="21"/>
         </w:rPr>
-        <w:t xml:space="preserve">예측 결과를 올리브영 실제 인기제품과 연결해서 "진짜 쓸모 있는지" 보여줌</w:t>
+        <w:t xml:space="preserve">예측 결과를 올리브영 실제 인기 제품 데이터와 연결하여 실무적 활용 가능성을 제시합니다.</w:t>
       </w:r>
     </w:p>
     <w:p>
@@ -570,7 +570,7 @@
           <w:sz w:val="26"/>
           <w:szCs w:val="26"/>
         </w:rPr>
-        <w:t xml:space="preserve">5. 어떻게 할 건지 (방법론 한눈에)</w:t>
+        <w:t xml:space="preserve">5. 연구 방법 개요</w:t>
       </w:r>
     </w:p>
     <w:p>
@@ -588,7 +588,7 @@
           <w:sz w:val="21"/>
           <w:szCs w:val="21"/>
         </w:rPr>
-        <w:t xml:space="preserve">네이버 검색어트렌드 API로 키워드별 월간 검색량 수집 (이미 완료)</w:t>
+        <w:t xml:space="preserve">네이버 검색어트렌드 API로 키워드별 월간 검색량 수집 (완료)</w:t>
       </w:r>
     </w:p>
     <w:p>
@@ -606,7 +606,7 @@
           <w:sz w:val="21"/>
           <w:szCs w:val="21"/>
         </w:rPr>
-        <w:t xml:space="preserve">카테고리별로 증가율 계산 → 통계적으로 "이상치"인 지점을 떡상으로 표시 (Tukey IQR)</w:t>
+        <w:t xml:space="preserve">카테고리별 전월 대비 증가율을 계산하고, 통계적 이상치 탐지법(Tukey IQR)으로 breakout 여부 라벨링</w:t>
       </w:r>
     </w:p>
     <w:p>
@@ -624,7 +624,7 @@
           <w:sz w:val="21"/>
           <w:szCs w:val="21"/>
         </w:rPr>
-        <w:t xml:space="preserve">떡상 되기 전 데이터만 가지고 feature 만들기 (증가율, 변동성 등)</w:t>
+        <w:t xml:space="preserve">breakout 시점 이전 데이터만으로 feature 구성 (증가율, 변동성 등)</w:t>
       </w:r>
     </w:p>
     <w:p>
@@ -642,7 +642,7 @@
           <w:sz w:val="21"/>
           <w:szCs w:val="21"/>
         </w:rPr>
-        <w:t xml:space="preserve">로지스틱회귀·XGBoost로 학습 → 과거 데이터로 학습해서 최근 데이터로 검증</w:t>
+        <w:t xml:space="preserve">로지스틱회귀·XGBoost로 모델 학습 후, 과거 구간 학습 → 이후 구간 검증(백테스팅)</w:t>
       </w:r>
     </w:p>
     <w:p>
@@ -660,7 +660,7 @@
           <w:sz w:val="21"/>
           <w:szCs w:val="21"/>
         </w:rPr>
-        <w:t xml:space="preserve">카테고리별로 성능 비교 → RQ2 답 찾기</w:t>
+        <w:t xml:space="preserve">카테고리별 모델 성능을 비교하여 RQ2에 대한 답 도출</w:t>
       </w:r>
     </w:p>
     <w:p>
@@ -678,7 +678,7 @@
           <w:sz w:val="21"/>
           <w:szCs w:val="21"/>
         </w:rPr>
-        <w:t xml:space="preserve">올리브영 인기상품 성분표와 대조해서 실무 사례 제시</w:t>
+        <w:t xml:space="preserve">올리브영 인기 제품 전성분 데이터와 대조하여 실무 사례 제시</w:t>
       </w:r>
     </w:p>
     <w:p>
@@ -694,59 +694,59 @@
           <w:sz w:val="26"/>
           <w:szCs w:val="26"/>
         </w:rPr>
-        <w:t xml:space="preserve">6. 지금 상태</w:t>
-      </w:r>
-    </w:p>
-    <w:p>
-      <w:pPr>
-        <w:spacing w:after="80" w:line="280"/>
-      </w:pPr>
-      <w:r>
-        <w:rPr>
-          <w:rFonts w:ascii="맑은 고딕" w:cs="맑은 고딕" w:eastAsia="맑은 고딕" w:hAnsi="맑은 고딕"/>
-          <w:sz w:val="21"/>
-          <w:szCs w:val="21"/>
-        </w:rPr>
-        <w:t xml:space="preserve">✅ 국내 논문 13편 + 해외 논문 3편, 전부 원문으로 다 읽음</w:t>
-      </w:r>
-    </w:p>
-    <w:p>
-      <w:pPr>
-        <w:spacing w:after="80" w:line="280"/>
-      </w:pPr>
-      <w:r>
-        <w:rPr>
-          <w:rFonts w:ascii="맑은 고딕" w:cs="맑은 고딕" w:eastAsia="맑은 고딕" w:hAnsi="맑은 고딕"/>
-          <w:sz w:val="21"/>
-          <w:szCs w:val="21"/>
-        </w:rPr>
-        <w:t xml:space="preserve">✅ 방법론 설계 다 끝남 (근거까지 포함)</w:t>
-      </w:r>
-    </w:p>
-    <w:p>
-      <w:pPr>
-        <w:spacing w:after="80" w:line="280"/>
-      </w:pPr>
-      <w:r>
-        <w:rPr>
-          <w:rFonts w:ascii="맑은 고딕" w:cs="맑은 고딕" w:eastAsia="맑은 고딕" w:hAnsi="맑은 고딕"/>
-          <w:sz w:val="21"/>
-          <w:szCs w:val="21"/>
-        </w:rPr>
-        <w:t xml:space="preserve">✅ 서론~결론 전체 초안 작성 완료 (Ⅳ·Ⅴ장은 아직 실험 전이라 "계획"으로만 써둠)</w:t>
-      </w:r>
-    </w:p>
-    <w:p>
-      <w:pPr>
-        <w:spacing w:after="80" w:line="280"/>
-      </w:pPr>
-      <w:r>
-        <w:rPr>
-          <w:rFonts w:ascii="맑은 고딕" w:cs="맑은 고딕" w:eastAsia="맑은 고딕" w:hAnsi="맑은 고딕"/>
-          <w:sz w:val="21"/>
-          <w:szCs w:val="21"/>
-        </w:rPr>
-        <w:t xml:space="preserve">⏳ 실제 데이터 수집·모델 학습은 아직 시작 안 함 — 교수님 컨펌 받은 뒤 진행 예정</w:t>
+        <w:t xml:space="preserve">6. 현재 진행 상황</w:t>
+      </w:r>
+    </w:p>
+    <w:p>
+      <w:pPr>
+        <w:spacing w:after="80" w:line="280"/>
+      </w:pPr>
+      <w:r>
+        <w:rPr>
+          <w:rFonts w:ascii="맑은 고딕" w:cs="맑은 고딕" w:eastAsia="맑은 고딕" w:hAnsi="맑은 고딕"/>
+          <w:sz w:val="21"/>
+          <w:szCs w:val="21"/>
+        </w:rPr>
+        <w:t xml:space="preserve">국내 학위논문 13편, 해외 논문 3편 원문 검토 완료</w:t>
+      </w:r>
+    </w:p>
+    <w:p>
+      <w:pPr>
+        <w:spacing w:after="80" w:line="280"/>
+      </w:pPr>
+      <w:r>
+        <w:rPr>
+          <w:rFonts w:ascii="맑은 고딕" w:cs="맑은 고딕" w:eastAsia="맑은 고딕" w:hAnsi="맑은 고딕"/>
+          <w:sz w:val="21"/>
+          <w:szCs w:val="21"/>
+        </w:rPr>
+        <w:t xml:space="preserve">방법론 설계 및 근거 확보 완료</w:t>
+      </w:r>
+    </w:p>
+    <w:p>
+      <w:pPr>
+        <w:spacing w:after="80" w:line="280"/>
+      </w:pPr>
+      <w:r>
+        <w:rPr>
+          <w:rFonts w:ascii="맑은 고딕" w:cs="맑은 고딕" w:eastAsia="맑은 고딕" w:hAnsi="맑은 고딕"/>
+          <w:sz w:val="21"/>
+          <w:szCs w:val="21"/>
+        </w:rPr>
+        <w:t xml:space="preserve">서론~결론 전체 초안 작성 완료 (단, Ⅳ장 실험 결과와 Ⅴ장 결론은 실제 데이터 수집·모델 학습 이전이므로 수행 계획 형태로 작성)</w:t>
+      </w:r>
+    </w:p>
+    <w:p>
+      <w:pPr>
+        <w:spacing w:after="80" w:line="280"/>
+      </w:pPr>
+      <w:r>
+        <w:rPr>
+          <w:rFonts w:ascii="맑은 고딕" w:cs="맑은 고딕" w:eastAsia="맑은 고딕" w:hAnsi="맑은 고딕"/>
+          <w:sz w:val="21"/>
+          <w:szCs w:val="21"/>
+        </w:rPr>
+        <w:t xml:space="preserve">실제 데이터 수집 및 모델 학습은 지도교수님 검토 이후 진행 예정</w:t>
       </w:r>
     </w:p>
     <w:p>
@@ -762,7 +762,7 @@
           <w:sz w:val="26"/>
           <w:szCs w:val="26"/>
         </w:rPr>
-        <w:t xml:space="preserve">7. 교수님께 여쭤볼 것 (핵심만)</w:t>
+        <w:t xml:space="preserve">7. 지도교수님께 여쭙고 싶은 부분</w:t>
       </w:r>
     </w:p>
     <w:p>
@@ -780,7 +780,7 @@
           <w:sz w:val="21"/>
           <w:szCs w:val="21"/>
         </w:rPr>
-        <w:t xml:space="preserve">"화장품 도메인 최초 적용 + 카테고리별 비교"라는 차별점이 심사에서 통할 수준인지</w:t>
+        <w:t xml:space="preserve">"화장품 도메인 최초 적용 + 카테고리 간 비교"라는 차별점이 학술제 심사 기준으로 충분한지</w:t>
       </w:r>
     </w:p>
     <w:p>
@@ -798,7 +798,7 @@
           <w:sz w:val="21"/>
           <w:szCs w:val="21"/>
         </w:rPr>
-        <w:t xml:space="preserve">Tukey IQR로 떡상 기준 잡은 게 충분히 설득력 있는지</w:t>
+        <w:t xml:space="preserve">Tukey IQR을 breakout 기준으로 채택한 근거가 방법론적으로 충분히 설득력이 있는지</w:t>
       </w:r>
     </w:p>
     <w:p>
@@ -816,7 +816,7 @@
           <w:sz w:val="21"/>
           <w:szCs w:val="21"/>
         </w:rPr>
-        <w:t xml:space="preserve">지금처럼 Ⅳ·Ⅴ장을 "계획"으로 먼저 보여드려도 되는지, 아니면 작은 실험이라도 돌려서 결과를 보여드려야 하는지</w:t>
+        <w:t xml:space="preserve">Ⅳ·Ⅴ장을 계획 형태로 먼저 검토받은 뒤 실제 데이터로 보완하는 순서가 적절한지, 아니면 소규모 예비 실험 결과를 먼저 제시하는 것이 나은지</w:t>
       </w:r>
     </w:p>
     <w:sectPr>

</xml_diff>

<commit_message>
Remove remaining informal slang from table cells in advisor summary
</commit_message>
<xml_diff>
--- a/논문_요약본_쉬운버전.docx
+++ b/논문_요약본_쉬운버전.docx
@@ -261,7 +261,7 @@
                 <w:sz w:val="19"/>
                 <w:szCs w:val="19"/>
               </w:rPr>
-              <w:t xml:space="preserve">"떡상 여부를 이진분류로 예측"한다는 아이디어 자체</w:t>
+              <w:t xml:space="preserve">breakout 여부를 분류 문제로 예측한다는 접근 자체</w:t>
             </w:r>
           </w:p>
         </w:tc>
@@ -284,7 +284,7 @@
                 <w:sz w:val="19"/>
                 <w:szCs w:val="19"/>
               </w:rPr>
-              <w:t xml:space="preserve">해시태그 인기도 예측(Ma et al. 2013), 주식 breakout 예측(Ansary 2022) 논문에서 이미 씀</w:t>
+              <w:t xml:space="preserve">해시태그 인기도 예측(Ma, Sun &amp; Cong, 2013), 주식 breakout 예측(Ansary, 2022)</w:t>
             </w:r>
           </w:p>
         </w:tc>
@@ -309,7 +309,7 @@
                 <w:sz w:val="19"/>
                 <w:szCs w:val="19"/>
               </w:rPr>
-              <w:t xml:space="preserve">떡상 기준을 임의로 정하지 않고 통계적으로 정하는 방법(Tukey IQR)</w:t>
+              <w:t xml:space="preserve">breakout 기준을 임의로 정하지 않고 통계적으로 설정하는 방법(Tukey IQR)</w:t>
             </w:r>
           </w:p>
         </w:tc>
@@ -332,7 +332,7 @@
                 <w:sz w:val="19"/>
                 <w:szCs w:val="19"/>
               </w:rPr>
-              <w:t xml:space="preserve">중고차 가격예측(김병완 2021)</w:t>
+              <w:t xml:space="preserve">중고차 가격예측(김병완, 2021)</w:t>
             </w:r>
           </w:p>
         </w:tc>

</xml_diff>